<commit_message>
=== v1.7 Production version ===
Signed-off-by: Jan Franken <jan.franken@lionscreek.ca>
</commit_message>
<xml_diff>
--- a/other/Basket_Booster_Discounts_Integrated_Requirements_and_Architecture.docx
+++ b/other/Basket_Booster_Discounts_Integrated_Requirements_and_Architecture.docx
@@ -37,16 +37,28 @@
         <w:rPr>
           <w:rStyle w:val="Strong"/>
         </w:rPr>
-        <w:t>1.1</w:t>
-      </w:r>
-      <w:r>
-        <w:t xml:space="preserve"> | Date: </w:t>
+        <w:t>1.</w:t>
       </w:r>
       <w:r>
         <w:rPr>
           <w:rStyle w:val="Strong"/>
         </w:rPr>
-        <w:t>2026-01-31</w:t>
+        <w:t>7</w:t>
+      </w:r>
+      <w:r>
+        <w:t xml:space="preserve"> | Date: </w:t>
+      </w:r>
+      <w:r>
+        <w:rPr>
+          <w:rStyle w:val="Strong"/>
+        </w:rPr>
+        <w:t>2026-0</w:t>
+      </w:r>
+      <w:r>
+        <w:rPr>
+          <w:rStyle w:val="Strong"/>
+        </w:rPr>
+        <w:t>4-14</w:t>
       </w:r>
     </w:p>
     <w:p>
@@ -177,15 +189,7 @@
         <w:pStyle w:val="NormalWeb"/>
       </w:pPr>
       <w:r>
-        <w:t xml:space="preserve">During cart/checkout evaluation, the function totals BE across cart lines using product and variant </w:t>
-      </w:r>
-      <w:proofErr w:type="spellStart"/>
-      <w:r>
-        <w:t>metafields</w:t>
-      </w:r>
-      <w:proofErr w:type="spellEnd"/>
-      <w:r>
-        <w:t>, calculates how many full triggers are reached, and applies a fixed amount off the order subtotal, subject to the configured cap.</w:t>
+        <w:t>During cart/checkout evaluation, the function totals BE across cart lines using product and variant metafields, calculates how many full triggers are reached, and applies a fixed amount off the order subtotal, subject to the configured cap.</w:t>
       </w:r>
     </w:p>
     <w:p>
@@ -1942,13 +1946,8 @@
           <w:numId w:val="11"/>
         </w:numPr>
       </w:pPr>
-      <w:proofErr w:type="spellStart"/>
-      <w:r>
-        <w:t>Metafield</w:t>
-      </w:r>
-      <w:proofErr w:type="spellEnd"/>
-      <w:r>
-        <w:t xml:space="preserve">-based BE calculation using </w:t>
+      <w:r>
+        <w:t xml:space="preserve">Metafield-based BE calculation using </w:t>
       </w:r>
       <w:r>
         <w:rPr>
@@ -2075,15 +2074,7 @@
         <w:pStyle w:val="NormalWeb"/>
       </w:pPr>
       <w:r>
-        <w:t xml:space="preserve">A normalized unit representing mixed package sizes as a single count. Each product or variant provides an integer BE value via </w:t>
-      </w:r>
-      <w:proofErr w:type="spellStart"/>
-      <w:r>
-        <w:t>metafield</w:t>
-      </w:r>
-      <w:proofErr w:type="spellEnd"/>
-      <w:r>
-        <w:t>. The cart's total BE is the sum of:</w:t>
+        <w:t>A normalized unit representing mixed package sizes as a single count. Each product or variant provides an integer BE value via metafield. The cart's total BE is the sum of:</w:t>
       </w:r>
     </w:p>
     <w:p>
@@ -2114,14 +2105,9 @@
       </w:pPr>
       <w:bookmarkStart w:id="7" w:name="_Toc221186176"/>
       <w:r>
-        <w:t xml:space="preserve">Canonical BE </w:t>
-      </w:r>
-      <w:proofErr w:type="spellStart"/>
-      <w:r>
-        <w:t>Metafield</w:t>
+        <w:t>Canonical BE Metafield</w:t>
       </w:r>
       <w:bookmarkEnd w:id="7"/>
-      <w:proofErr w:type="spellEnd"/>
     </w:p>
     <w:p>
       <w:pPr>
@@ -2164,14 +2150,12 @@
       <w:r>
         <w:t xml:space="preserve"> </w:t>
       </w:r>
-      <w:proofErr w:type="spellStart"/>
       <w:r>
         <w:rPr>
           <w:rStyle w:val="HTMLCode"/>
         </w:rPr>
         <w:t>bottle_equivalent</w:t>
       </w:r>
-      <w:proofErr w:type="spellEnd"/>
     </w:p>
     <w:p>
       <w:pPr>
@@ -2196,23 +2180,7 @@
         <w:pStyle w:val="NormalWeb"/>
       </w:pPr>
       <w:r>
-        <w:t xml:space="preserve">Variant </w:t>
-      </w:r>
-      <w:proofErr w:type="spellStart"/>
-      <w:r>
-        <w:t>metafield</w:t>
-      </w:r>
-      <w:proofErr w:type="spellEnd"/>
-      <w:r>
-        <w:t xml:space="preserve"> takes precedence; if absent, the product </w:t>
-      </w:r>
-      <w:proofErr w:type="spellStart"/>
-      <w:r>
-        <w:t>metafield</w:t>
-      </w:r>
-      <w:proofErr w:type="spellEnd"/>
-      <w:r>
-        <w:t xml:space="preserve"> is used.</w:t>
+        <w:t>Variant metafield takes precedence; if absent, the product metafield is used.</w:t>
       </w:r>
     </w:p>
     <w:p>
@@ -2221,15 +2189,7 @@
       </w:pPr>
       <w:bookmarkStart w:id="8" w:name="_Toc221186177"/>
       <w:r>
-        <w:t xml:space="preserve">Discount Configuration </w:t>
-      </w:r>
-      <w:proofErr w:type="spellStart"/>
-      <w:r>
-        <w:t>Metafield</w:t>
-      </w:r>
-      <w:proofErr w:type="spellEnd"/>
-      <w:r>
-        <w:t xml:space="preserve"> (Authoritative)</w:t>
+        <w:t>Discount Configuration Metafield (Authoritative)</w:t>
       </w:r>
       <w:bookmarkEnd w:id="8"/>
     </w:p>
@@ -2315,14 +2275,12 @@
       <w:r>
         <w:t xml:space="preserve"> </w:t>
       </w:r>
-      <w:proofErr w:type="spellStart"/>
       <w:r>
         <w:rPr>
           <w:rStyle w:val="HTMLCode"/>
         </w:rPr>
         <w:t>json</w:t>
       </w:r>
-      <w:proofErr w:type="spellEnd"/>
     </w:p>
     <w:p>
       <w:pPr>
@@ -2357,21 +2315,7 @@
         <w:rPr>
           <w:rStyle w:val="HTMLCode"/>
         </w:rPr>
-        <w:t xml:space="preserve">  "</w:t>
-      </w:r>
-      <w:proofErr w:type="spellStart"/>
-      <w:r>
-        <w:rPr>
-          <w:rStyle w:val="HTMLCode"/>
-        </w:rPr>
-        <w:t>triggerBE</w:t>
-      </w:r>
-      <w:proofErr w:type="spellEnd"/>
-      <w:r>
-        <w:rPr>
-          <w:rStyle w:val="HTMLCode"/>
-        </w:rPr>
-        <w:t>": 7,</w:t>
+        <w:t xml:space="preserve">  "triggerBE": 7,</w:t>
       </w:r>
     </w:p>
     <w:p>
@@ -2385,21 +2329,7 @@
         <w:rPr>
           <w:rStyle w:val="HTMLCode"/>
         </w:rPr>
-        <w:t xml:space="preserve">  "</w:t>
-      </w:r>
-      <w:proofErr w:type="spellStart"/>
-      <w:r>
-        <w:rPr>
-          <w:rStyle w:val="HTMLCode"/>
-        </w:rPr>
-        <w:t>amountPerTrigger</w:t>
-      </w:r>
-      <w:proofErr w:type="spellEnd"/>
-      <w:r>
-        <w:rPr>
-          <w:rStyle w:val="HTMLCode"/>
-        </w:rPr>
-        <w:t>": 15,</w:t>
+        <w:t xml:space="preserve">  "amountPerTrigger": 15,</w:t>
       </w:r>
     </w:p>
     <w:p>
@@ -2413,21 +2343,7 @@
         <w:rPr>
           <w:rStyle w:val="HTMLCode"/>
         </w:rPr>
-        <w:t xml:space="preserve">  "</w:t>
-      </w:r>
-      <w:proofErr w:type="spellStart"/>
-      <w:r>
-        <w:rPr>
-          <w:rStyle w:val="HTMLCode"/>
-        </w:rPr>
-        <w:t>maxDiscount</w:t>
-      </w:r>
-      <w:proofErr w:type="spellEnd"/>
-      <w:r>
-        <w:rPr>
-          <w:rStyle w:val="HTMLCode"/>
-        </w:rPr>
-        <w:t>": 25</w:t>
+        <w:t xml:space="preserve">  "maxDiscount": 25</w:t>
       </w:r>
     </w:p>
     <w:p>
@@ -2458,15 +2374,7 @@
         <w:t>$app</w:t>
       </w:r>
       <w:r>
-        <w:t xml:space="preserve"> </w:t>
-      </w:r>
-      <w:proofErr w:type="spellStart"/>
-      <w:r>
-        <w:t>metafield</w:t>
-      </w:r>
-      <w:proofErr w:type="spellEnd"/>
-      <w:r>
-        <w:t xml:space="preserve"> namespace is intentionally </w:t>
+        <w:t xml:space="preserve"> metafield namespace is intentionally </w:t>
       </w:r>
       <w:r>
         <w:rPr>
@@ -2646,13 +2554,8 @@
             <w:hideMark/>
           </w:tcPr>
           <w:p>
-            <w:proofErr w:type="gramStart"/>
-            <w:r>
-              <w:t>Encourages</w:t>
-            </w:r>
-            <w:proofErr w:type="gramEnd"/>
-            <w:r>
-              <w:t xml:space="preserve"> larger baskets across mixed sizes.</w:t>
+            <w:r>
+              <w:t>Encourages larger baskets across mixed sizes.</w:t>
             </w:r>
           </w:p>
         </w:tc>
@@ -2747,15 +2650,7 @@
           </w:tcPr>
           <w:p>
             <w:r>
-              <w:t xml:space="preserve">Support store-managed BE mapping via product/variant </w:t>
-            </w:r>
-            <w:proofErr w:type="spellStart"/>
-            <w:r>
-              <w:t>metafields</w:t>
-            </w:r>
-            <w:proofErr w:type="spellEnd"/>
-            <w:r>
-              <w:t>.</w:t>
+              <w:t>Support store-managed BE mapping via product/variant metafields.</w:t>
             </w:r>
           </w:p>
         </w:tc>
@@ -2944,21 +2839,11 @@
           <w:rStyle w:val="HTMLCode"/>
         </w:rPr>
       </w:pPr>
-      <w:proofErr w:type="spellStart"/>
-      <w:proofErr w:type="gramStart"/>
       <w:r>
         <w:rPr>
           <w:rStyle w:val="HTMLCode"/>
         </w:rPr>
-        <w:t>discount.metafield</w:t>
-      </w:r>
-      <w:proofErr w:type="spellEnd"/>
-      <w:proofErr w:type="gramEnd"/>
-      <w:r>
-        <w:rPr>
-          <w:rStyle w:val="HTMLCode"/>
-        </w:rPr>
-        <w:t>(namespace: "custom", key: "function-configuration")</w:t>
+        <w:t>discount.metafield(namespace: "custom", key: "function-configuration")</w:t>
       </w:r>
     </w:p>
     <w:p>
@@ -3093,13 +2978,8 @@
             <w:hideMark/>
           </w:tcPr>
           <w:p>
-            <w:proofErr w:type="gramStart"/>
-            <w:r>
-              <w:t>Compute</w:t>
-            </w:r>
-            <w:proofErr w:type="gramEnd"/>
-            <w:r>
-              <w:t xml:space="preserve"> cart total BE.</w:t>
+            <w:r>
+              <w:t>Compute cart total BE.</w:t>
             </w:r>
           </w:p>
         </w:tc>
@@ -3139,13 +3019,8 @@
             <w:hideMark/>
           </w:tcPr>
           <w:p>
-            <w:proofErr w:type="gramStart"/>
-            <w:r>
-              <w:t>Variant-first</w:t>
-            </w:r>
-            <w:proofErr w:type="gramEnd"/>
-            <w:r>
-              <w:t>, product-fallback BE resolution.</w:t>
+            <w:r>
+              <w:t>Variant-first, product-fallback BE resolution.</w:t>
             </w:r>
           </w:p>
         </w:tc>
@@ -3157,15 +3032,7 @@
           </w:tcPr>
           <w:p>
             <w:r>
-              <w:t xml:space="preserve">Variant overrides </w:t>
-            </w:r>
-            <w:proofErr w:type="gramStart"/>
-            <w:r>
-              <w:t>product;</w:t>
-            </w:r>
-            <w:proofErr w:type="gramEnd"/>
-            <w:r>
-              <w:t xml:space="preserve"> missing values treated as 0.</w:t>
+              <w:t>Variant overrides product; missing values treated as 0.</w:t>
             </w:r>
           </w:p>
         </w:tc>
@@ -3205,68 +3072,23 @@
             <w:hideMark/>
           </w:tcPr>
           <w:p>
-            <w:proofErr w:type="gramStart"/>
             <w:r>
               <w:rPr>
                 <w:rStyle w:val="HTMLCode"/>
                 <w:rFonts w:eastAsiaTheme="minorEastAsia"/>
               </w:rPr>
-              <w:t>floor(</w:t>
-            </w:r>
-            <w:proofErr w:type="spellStart"/>
-            <w:proofErr w:type="gramEnd"/>
+              <w:t>floor(totalBE / triggerBE) × amountPerTrigger</w:t>
+            </w:r>
+            <w:r>
+              <w:t xml:space="preserve">, capped by </w:t>
+            </w:r>
             <w:r>
               <w:rPr>
                 <w:rStyle w:val="HTMLCode"/>
                 <w:rFonts w:eastAsiaTheme="minorEastAsia"/>
               </w:rPr>
-              <w:t>totalBE</w:t>
-            </w:r>
-            <w:proofErr w:type="spellEnd"/>
-            <w:r>
-              <w:rPr>
-                <w:rStyle w:val="HTMLCode"/>
-                <w:rFonts w:eastAsiaTheme="minorEastAsia"/>
-              </w:rPr>
-              <w:t xml:space="preserve"> / </w:t>
-            </w:r>
-            <w:proofErr w:type="spellStart"/>
-            <w:r>
-              <w:rPr>
-                <w:rStyle w:val="HTMLCode"/>
-                <w:rFonts w:eastAsiaTheme="minorEastAsia"/>
-              </w:rPr>
-              <w:t>triggerBE</w:t>
-            </w:r>
-            <w:proofErr w:type="spellEnd"/>
-            <w:r>
-              <w:rPr>
-                <w:rStyle w:val="HTMLCode"/>
-                <w:rFonts w:eastAsiaTheme="minorEastAsia"/>
-              </w:rPr>
-              <w:t xml:space="preserve">) × </w:t>
-            </w:r>
-            <w:proofErr w:type="spellStart"/>
-            <w:r>
-              <w:rPr>
-                <w:rStyle w:val="HTMLCode"/>
-                <w:rFonts w:eastAsiaTheme="minorEastAsia"/>
-              </w:rPr>
-              <w:t>amountPerTrigger</w:t>
-            </w:r>
-            <w:proofErr w:type="spellEnd"/>
-            <w:r>
-              <w:t xml:space="preserve">, capped by </w:t>
-            </w:r>
-            <w:proofErr w:type="spellStart"/>
-            <w:r>
-              <w:rPr>
-                <w:rStyle w:val="HTMLCode"/>
-                <w:rFonts w:eastAsiaTheme="minorEastAsia"/>
-              </w:rPr>
               <w:t>maxDiscount</w:t>
             </w:r>
-            <w:proofErr w:type="spellEnd"/>
             <w:r>
               <w:t xml:space="preserve"> and subtotal.</w:t>
             </w:r>
@@ -3406,14 +3228,12 @@
       <w:r>
         <w:t xml:space="preserve"> on the </w:t>
       </w:r>
-      <w:proofErr w:type="spellStart"/>
       <w:r>
         <w:rPr>
           <w:rStyle w:val="Strong"/>
         </w:rPr>
         <w:t>DiscountAutomaticNode</w:t>
       </w:r>
-      <w:proofErr w:type="spellEnd"/>
       <w:r>
         <w:t>.</w:t>
       </w:r>
@@ -3439,15 +3259,7 @@
         </w:numPr>
       </w:pPr>
       <w:r>
-        <w:t xml:space="preserve">UI provides guidance for BE </w:t>
-      </w:r>
-      <w:proofErr w:type="spellStart"/>
-      <w:r>
-        <w:t>metafield</w:t>
-      </w:r>
-      <w:proofErr w:type="spellEnd"/>
-      <w:r>
-        <w:t xml:space="preserve"> setup.</w:t>
+        <w:t>UI provides guidance for BE metafield setup.</w:t>
       </w:r>
     </w:p>
     <w:p>
@@ -3463,15 +3275,7 @@
       </w:pPr>
       <w:bookmarkStart w:id="13" w:name="_Toc221186182"/>
       <w:r>
-        <w:t xml:space="preserve">5.3 </w:t>
-      </w:r>
-      <w:proofErr w:type="spellStart"/>
-      <w:r>
-        <w:t>Metafields</w:t>
-      </w:r>
-      <w:proofErr w:type="spellEnd"/>
-      <w:r>
-        <w:t xml:space="preserve"> and Catalog Setup</w:t>
+        <w:t>5.3 Metafields and Catalog Setup</w:t>
       </w:r>
       <w:bookmarkEnd w:id="13"/>
     </w:p>
@@ -3484,15 +3288,7 @@
         </w:numPr>
       </w:pPr>
       <w:r>
-        <w:t xml:space="preserve">Product and Variant </w:t>
-      </w:r>
-      <w:proofErr w:type="spellStart"/>
-      <w:r>
-        <w:t>metafield</w:t>
-      </w:r>
-      <w:proofErr w:type="spellEnd"/>
-      <w:r>
-        <w:t xml:space="preserve"> definition required:</w:t>
+        <w:t>Product and Variant metafield definition required:</w:t>
       </w:r>
     </w:p>
     <w:p>
@@ -3503,22 +3299,12 @@
           <w:numId w:val="16"/>
         </w:numPr>
       </w:pPr>
-      <w:proofErr w:type="spellStart"/>
-      <w:proofErr w:type="gramStart"/>
       <w:r>
         <w:rPr>
           <w:rStyle w:val="HTMLCode"/>
         </w:rPr>
-        <w:t>loyalty.bottle</w:t>
-      </w:r>
-      <w:proofErr w:type="gramEnd"/>
-      <w:r>
-        <w:rPr>
-          <w:rStyle w:val="HTMLCode"/>
-        </w:rPr>
-        <w:t>_equivalent</w:t>
-      </w:r>
-      <w:proofErr w:type="spellEnd"/>
+        <w:t>loyalty.bottle_equivalent</w:t>
+      </w:r>
       <w:r>
         <w:t xml:space="preserve"> (Integer)</w:t>
       </w:r>
@@ -3544,15 +3330,7 @@
         </w:numPr>
       </w:pPr>
       <w:r>
-        <w:t xml:space="preserve">Items without BE </w:t>
-      </w:r>
-      <w:proofErr w:type="spellStart"/>
-      <w:r>
-        <w:t>metafields</w:t>
-      </w:r>
-      <w:proofErr w:type="spellEnd"/>
-      <w:r>
-        <w:t xml:space="preserve"> contribute 0 BE.</w:t>
+        <w:t>Items without BE metafields contribute 0 BE.</w:t>
       </w:r>
     </w:p>
     <w:p>
@@ -3641,15 +3419,7 @@
         <w:t>Maintainability:</w:t>
       </w:r>
       <w:r>
-        <w:t xml:space="preserve"> Single canonical </w:t>
-      </w:r>
-      <w:proofErr w:type="spellStart"/>
-      <w:r>
-        <w:t>metafield</w:t>
-      </w:r>
-      <w:proofErr w:type="spellEnd"/>
-      <w:r>
-        <w:t xml:space="preserve"> definitions and constants.</w:t>
+        <w:t xml:space="preserve"> Single canonical metafield definitions and constants.</w:t>
       </w:r>
     </w:p>
     <w:p>
@@ -3752,23 +3522,7 @@
         </w:numPr>
       </w:pPr>
       <w:r>
-        <w:t xml:space="preserve">AWS </w:t>
-      </w:r>
-      <w:proofErr w:type="spellStart"/>
-      <w:r>
-        <w:t>Lightsail</w:t>
-      </w:r>
-      <w:proofErr w:type="spellEnd"/>
-      <w:r>
-        <w:t xml:space="preserve"> deployment (Nginx + Node + </w:t>
-      </w:r>
-      <w:proofErr w:type="spellStart"/>
-      <w:r>
-        <w:t>systemd</w:t>
-      </w:r>
-      <w:proofErr w:type="spellEnd"/>
-      <w:r>
-        <w:t>)</w:t>
+        <w:t>AWS Lightsail deployment (Nginx + Node + systemd)</w:t>
       </w:r>
     </w:p>
     <w:p>
@@ -4438,21 +4192,7 @@
         <w:rPr>
           <w:rStyle w:val="HTMLCode"/>
         </w:rPr>
-        <w:t xml:space="preserve">  "</w:t>
-      </w:r>
-      <w:proofErr w:type="spellStart"/>
-      <w:r>
-        <w:rPr>
-          <w:rStyle w:val="HTMLCode"/>
-        </w:rPr>
-        <w:t>triggerBE</w:t>
-      </w:r>
-      <w:proofErr w:type="spellEnd"/>
-      <w:r>
-        <w:rPr>
-          <w:rStyle w:val="HTMLCode"/>
-        </w:rPr>
-        <w:t>": 7,</w:t>
+        <w:t xml:space="preserve">  "triggerBE": 7,</w:t>
       </w:r>
     </w:p>
     <w:p>
@@ -4467,21 +4207,7 @@
           <w:rStyle w:val="HTMLCode"/>
         </w:rPr>
         <w:lastRenderedPageBreak/>
-        <w:t xml:space="preserve">  "</w:t>
-      </w:r>
-      <w:proofErr w:type="spellStart"/>
-      <w:r>
-        <w:rPr>
-          <w:rStyle w:val="HTMLCode"/>
-        </w:rPr>
-        <w:t>amountPerTrigger</w:t>
-      </w:r>
-      <w:proofErr w:type="spellEnd"/>
-      <w:r>
-        <w:rPr>
-          <w:rStyle w:val="HTMLCode"/>
-        </w:rPr>
-        <w:t>": 15,</w:t>
+        <w:t xml:space="preserve">  "amountPerTrigger": 15,</w:t>
       </w:r>
     </w:p>
     <w:p>
@@ -4495,21 +4221,7 @@
         <w:rPr>
           <w:rStyle w:val="HTMLCode"/>
         </w:rPr>
-        <w:t xml:space="preserve">  "</w:t>
-      </w:r>
-      <w:proofErr w:type="spellStart"/>
-      <w:r>
-        <w:rPr>
-          <w:rStyle w:val="HTMLCode"/>
-        </w:rPr>
-        <w:t>maxDiscount</w:t>
-      </w:r>
-      <w:proofErr w:type="spellEnd"/>
-      <w:r>
-        <w:rPr>
-          <w:rStyle w:val="HTMLCode"/>
-        </w:rPr>
-        <w:t>": 25</w:t>
+        <w:t xml:space="preserve">  "maxDiscount": 25</w:t>
       </w:r>
     </w:p>
     <w:p>
@@ -4563,25 +4275,7 @@
           <w:bCs/>
           <w:lang w:val="en-CA"/>
         </w:rPr>
-        <w:t>Why we are not using $app (</w:t>
-      </w:r>
-      <w:proofErr w:type="gramStart"/>
-      <w:r>
-        <w:rPr>
-          <w:b/>
-          <w:bCs/>
-          <w:lang w:val="en-CA"/>
-        </w:rPr>
-        <w:t>brief summary</w:t>
-      </w:r>
-      <w:proofErr w:type="gramEnd"/>
-      <w:r>
-        <w:rPr>
-          <w:b/>
-          <w:bCs/>
-          <w:lang w:val="en-CA"/>
-        </w:rPr>
-        <w:t>)</w:t>
+        <w:t>Why we are not using $app (brief summary)</w:t>
       </w:r>
     </w:p>
     <w:p>
@@ -4608,48 +4302,20 @@
         <w:rPr>
           <w:lang w:val="en-CA"/>
         </w:rPr>
-        <w:t xml:space="preserve"> and $app does not reliably expose the </w:t>
-      </w:r>
-      <w:proofErr w:type="spellStart"/>
-      <w:r>
+        <w:t xml:space="preserve"> and $app does not reliably expose the metafield you need at runtime.</w:t>
+      </w:r>
+    </w:p>
+    <w:p>
+      <w:pPr>
         <w:rPr>
           <w:lang w:val="en-CA"/>
         </w:rPr>
-        <w:t>metafield</w:t>
-      </w:r>
-      <w:proofErr w:type="spellEnd"/>
+      </w:pPr>
       <w:r>
         <w:rPr>
           <w:lang w:val="en-CA"/>
         </w:rPr>
-        <w:t xml:space="preserve"> you need at runtime.</w:t>
-      </w:r>
-    </w:p>
-    <w:p>
-      <w:pPr>
-        <w:rPr>
-          <w:lang w:val="en-CA"/>
-        </w:rPr>
-      </w:pPr>
-      <w:r>
-        <w:rPr>
-          <w:lang w:val="en-CA"/>
-        </w:rPr>
-        <w:t xml:space="preserve">What we learned from </w:t>
-      </w:r>
-      <w:proofErr w:type="spellStart"/>
-      <w:r>
-        <w:rPr>
-          <w:lang w:val="en-CA"/>
-        </w:rPr>
-        <w:t>GraphiQL</w:t>
-      </w:r>
-      <w:proofErr w:type="spellEnd"/>
-      <w:r>
-        <w:rPr>
-          <w:lang w:val="en-CA"/>
-        </w:rPr>
-        <w:t xml:space="preserve"> debugging:</w:t>
+        <w:t>What we learned from GraphiQL debugging:</w:t>
       </w:r>
     </w:p>
     <w:p>
@@ -4668,7 +4334,6 @@
         </w:rPr>
         <w:t xml:space="preserve">For </w:t>
       </w:r>
-      <w:proofErr w:type="spellStart"/>
       <w:r>
         <w:rPr>
           <w:b/>
@@ -4677,7 +4342,6 @@
         </w:rPr>
         <w:t>DiscountAutomaticNode</w:t>
       </w:r>
-      <w:proofErr w:type="spellEnd"/>
       <w:r>
         <w:rPr>
           <w:lang w:val="en-CA"/>
@@ -4694,21 +4358,7 @@
         <w:rPr>
           <w:lang w:val="en-CA"/>
         </w:rPr>
-        <w:t xml:space="preserve"> </w:t>
-      </w:r>
-      <w:proofErr w:type="spellStart"/>
-      <w:r>
-        <w:rPr>
-          <w:lang w:val="en-CA"/>
-        </w:rPr>
-        <w:t>appCfg</w:t>
-      </w:r>
-      <w:proofErr w:type="spellEnd"/>
-      <w:r>
-        <w:rPr>
-          <w:lang w:val="en-CA"/>
-        </w:rPr>
-        <w:t xml:space="preserve"> is </w:t>
+        <w:t xml:space="preserve"> appCfg is </w:t>
       </w:r>
       <w:r>
         <w:rPr>
@@ -4734,21 +4384,7 @@
         <w:rPr>
           <w:lang w:val="en-CA"/>
         </w:rPr>
-        <w:t xml:space="preserve"> </w:t>
-      </w:r>
-      <w:proofErr w:type="spellStart"/>
-      <w:r>
-        <w:rPr>
-          <w:lang w:val="en-CA"/>
-        </w:rPr>
-        <w:t>customCfg</w:t>
-      </w:r>
-      <w:proofErr w:type="spellEnd"/>
-      <w:r>
-        <w:rPr>
-          <w:lang w:val="en-CA"/>
-        </w:rPr>
-        <w:t xml:space="preserve"> contains the real JSON config:</w:t>
+        <w:t xml:space="preserve"> customCfg contains the real JSON config:</w:t>
       </w:r>
     </w:p>
     <w:p>
@@ -4761,21 +4397,11 @@
           <w:lang w:val="en-CA"/>
         </w:rPr>
       </w:pPr>
-      <w:proofErr w:type="spellStart"/>
-      <w:proofErr w:type="gramStart"/>
       <w:r>
         <w:rPr>
           <w:lang w:val="en-CA"/>
         </w:rPr>
-        <w:t>custom.function</w:t>
-      </w:r>
-      <w:proofErr w:type="spellEnd"/>
-      <w:proofErr w:type="gramEnd"/>
-      <w:r>
-        <w:rPr>
-          <w:lang w:val="en-CA"/>
-        </w:rPr>
-        <w:t>-configuration = {"triggerBE":7,"amountPerTrigger":15,"maxDiscount":25}</w:t>
+        <w:t>custom.function-configuration = {"triggerBE":7,"amountPerTrigger":15,"maxDiscount":25}</w:t>
       </w:r>
       <w:r>
         <w:rPr>
@@ -4798,33 +4424,17 @@
         </w:rPr>
         <w:t>, not app-owned. (</w:t>
       </w:r>
-      <w:proofErr w:type="gramStart"/>
       <w:r>
         <w:rPr>
           <w:lang w:val="en-CA"/>
         </w:rPr>
         <w:t>the</w:t>
       </w:r>
-      <w:proofErr w:type="gramEnd"/>
       <w:r>
         <w:rPr>
           <w:lang w:val="en-CA"/>
         </w:rPr>
-        <w:t xml:space="preserve"> output explicitly showed </w:t>
-      </w:r>
-      <w:proofErr w:type="spellStart"/>
-      <w:r>
-        <w:rPr>
-          <w:lang w:val="en-CA"/>
-        </w:rPr>
-        <w:t>appCfg</w:t>
-      </w:r>
-      <w:proofErr w:type="spellEnd"/>
-      <w:r>
-        <w:rPr>
-          <w:lang w:val="en-CA"/>
-        </w:rPr>
-        <w:t>: null.)</w:t>
+        <w:t xml:space="preserve"> output explicitly showed appCfg: null.)</w:t>
       </w:r>
     </w:p>
     <w:p>
@@ -4886,46 +4496,14 @@
           <w:bCs/>
           <w:lang w:val="en-CA"/>
         </w:rPr>
-        <w:t xml:space="preserve">“Access to this namespace and key on </w:t>
-      </w:r>
-      <w:proofErr w:type="spellStart"/>
-      <w:r>
-        <w:rPr>
-          <w:b/>
-          <w:bCs/>
-          <w:lang w:val="en-CA"/>
-        </w:rPr>
-        <w:t>Metafields</w:t>
-      </w:r>
-      <w:proofErr w:type="spellEnd"/>
-      <w:r>
-        <w:rPr>
-          <w:b/>
-          <w:bCs/>
-          <w:lang w:val="en-CA"/>
-        </w:rPr>
-        <w:t xml:space="preserve"> for this resource type is not allowed.”</w:t>
+        <w:t>“Access to this namespace and key on Metafields for this resource type is not allowed.”</w:t>
       </w:r>
       <w:r>
         <w:rPr>
           <w:lang w:val="en-CA"/>
         </w:rPr>
         <w:br/>
-        <w:t xml:space="preserve">That’s a permissions/definition constraint on app-owned </w:t>
-      </w:r>
-      <w:proofErr w:type="spellStart"/>
-      <w:r>
-        <w:rPr>
-          <w:lang w:val="en-CA"/>
-        </w:rPr>
-        <w:t>metafields</w:t>
-      </w:r>
-      <w:proofErr w:type="spellEnd"/>
-      <w:r>
-        <w:rPr>
-          <w:lang w:val="en-CA"/>
-        </w:rPr>
-        <w:t xml:space="preserve"> for that resource type, and it will keep biting during review and upgrades.</w:t>
+        <w:t>That’s a permissions/definition constraint on app-owned metafields for that resource type, and it will keep biting during review and upgrades.</w:t>
       </w:r>
     </w:p>
     <w:p>
@@ -4942,21 +4520,7 @@
         <w:rPr>
           <w:lang w:val="en-CA"/>
         </w:rPr>
-        <w:t xml:space="preserve">$app in </w:t>
-      </w:r>
-      <w:proofErr w:type="spellStart"/>
-      <w:r>
-        <w:rPr>
-          <w:lang w:val="en-CA"/>
-        </w:rPr>
-        <w:t>GraphQL</w:t>
-      </w:r>
-      <w:proofErr w:type="spellEnd"/>
-      <w:r>
-        <w:rPr>
-          <w:lang w:val="en-CA"/>
-        </w:rPr>
-        <w:t xml:space="preserve"> is about the </w:t>
+        <w:t xml:space="preserve">$app in GraphQL is about the </w:t>
       </w:r>
       <w:r>
         <w:rPr>
@@ -4964,18 +4528,8 @@
           <w:bCs/>
           <w:lang w:val="en-CA"/>
         </w:rPr>
-        <w:t xml:space="preserve">App / </w:t>
-      </w:r>
-      <w:proofErr w:type="spellStart"/>
-      <w:r>
-        <w:rPr>
-          <w:b/>
-          <w:bCs/>
-          <w:lang w:val="en-CA"/>
-        </w:rPr>
-        <w:t>AppInstallation</w:t>
-      </w:r>
-      <w:proofErr w:type="spellEnd"/>
+        <w:t>App / AppInstallation</w:t>
+      </w:r>
       <w:r>
         <w:rPr>
           <w:lang w:val="en-CA"/>
@@ -5037,49 +4591,7 @@
         <w:rPr>
           <w:lang w:val="en-CA"/>
         </w:rPr>
-        <w:t>Discount*</w:t>
-      </w:r>
-      <w:proofErr w:type="spellStart"/>
-      <w:r>
-        <w:rPr>
-          <w:lang w:val="en-CA"/>
-        </w:rPr>
-        <w:t>Node.metafield</w:t>
-      </w:r>
-      <w:proofErr w:type="spellEnd"/>
-      <w:r>
-        <w:rPr>
-          <w:lang w:val="en-CA"/>
-        </w:rPr>
-        <w:t>(</w:t>
-      </w:r>
-      <w:proofErr w:type="spellStart"/>
-      <w:r>
-        <w:rPr>
-          <w:lang w:val="en-CA"/>
-        </w:rPr>
-        <w:t>namespace:"custom</w:t>
-      </w:r>
-      <w:proofErr w:type="spellEnd"/>
-      <w:r>
-        <w:rPr>
-          <w:lang w:val="en-CA"/>
-        </w:rPr>
-        <w:t xml:space="preserve">", </w:t>
-      </w:r>
-      <w:proofErr w:type="spellStart"/>
-      <w:r>
-        <w:rPr>
-          <w:lang w:val="en-CA"/>
-        </w:rPr>
-        <w:t>key:"function-configuration</w:t>
-      </w:r>
-      <w:proofErr w:type="spellEnd"/>
-      <w:r>
-        <w:rPr>
-          <w:lang w:val="en-CA"/>
-        </w:rPr>
-        <w:t>")</w:t>
+        <w:t>Discount*Node.metafield(namespace:"custom", key:"function-configuration")</w:t>
       </w:r>
     </w:p>
     <w:p>
@@ -5100,35 +4612,7 @@
         <w:rPr>
           <w:lang w:val="en-CA"/>
         </w:rPr>
-        <w:t xml:space="preserve"> using custom on the discount node is (a) observable in Admin </w:t>
-      </w:r>
-      <w:proofErr w:type="spellStart"/>
-      <w:r>
-        <w:rPr>
-          <w:lang w:val="en-CA"/>
-        </w:rPr>
-        <w:t>GraphQL</w:t>
-      </w:r>
-      <w:proofErr w:type="spellEnd"/>
-      <w:r>
-        <w:rPr>
-          <w:lang w:val="en-CA"/>
-        </w:rPr>
-        <w:t xml:space="preserve">, (b) works for automatic discounts (where </w:t>
-      </w:r>
-      <w:proofErr w:type="spellStart"/>
-      <w:r>
-        <w:rPr>
-          <w:lang w:val="en-CA"/>
-        </w:rPr>
-        <w:t>appCfg</w:t>
-      </w:r>
-      <w:proofErr w:type="spellEnd"/>
-      <w:r>
-        <w:rPr>
-          <w:lang w:val="en-CA"/>
-        </w:rPr>
-        <w:t xml:space="preserve"> was null), and (c) avoids the namespace access restriction that caused </w:t>
+        <w:t xml:space="preserve"> using custom on the discount node is (a) observable in Admin GraphQL, (b) works for automatic discounts (where appCfg was null), and (c) avoids the namespace access restriction that caused </w:t>
       </w:r>
       <w:r>
         <w:rPr>
@@ -7567,6 +7051,7 @@
   <w:style w:type="character" w:default="1" w:styleId="DefaultParagraphFont">
     <w:name w:val="Default Paragraph Font"/>
     <w:uiPriority w:val="1"/>
+    <w:semiHidden/>
     <w:unhideWhenUsed/>
   </w:style>
   <w:style w:type="table" w:default="1" w:styleId="TableNormal">

</xml_diff>